<commit_message>
Update final report with submission links
</commit_message>
<xml_diff>
--- a/report/report.docx
+++ b/report/report.docx
@@ -2,6 +2,68 @@
 <file path=word/document.xml><?xml version="1.0" encoding="utf-8"?>
 <w:document xmlns:wpc="http://schemas.microsoft.com/office/word/2010/wordprocessingCanvas" xmlns:cx="http://schemas.microsoft.com/office/drawing/2014/chartex" xmlns:cx1="http://schemas.microsoft.com/office/drawing/2015/9/8/chartex" xmlns:cx2="http://schemas.microsoft.com/office/drawing/2015/10/21/chartex" xmlns:cx3="http://schemas.microsoft.com/office/drawing/2016/5/9/chartex" xmlns:cx4="http://schemas.microsoft.com/office/drawing/2016/5/10/chartex" xmlns:cx5="http://schemas.microsoft.com/office/drawing/2016/5/11/chartex" xmlns:cx6="http://schemas.microsoft.com/office/drawing/2016/5/12/chartex" xmlns:cx7="http://schemas.microsoft.com/office/drawing/2016/5/13/chartex" xmlns:cx8="http://schemas.microsoft.com/office/drawing/2016/5/14/chartex" xmlns:mc="http://schemas.openxmlformats.org/markup-compatibility/2006" xmlns:m="http://schemas.openxmlformats.org/officeDocument/2006/math" xmlns:aink="http://schemas.microsoft.com/office/drawing/2016/ink" xmlns:am3d="http://schemas.microsoft.com/office/drawing/2017/model3d" xmlns:oel="http://schemas.microsoft.com/office/2019/extlst" xmlns:r="http://schemas.openxmlformats.org/officeDocument/2006/relationships" xmlns:wp14="http://schemas.microsoft.com/office/word/2010/wordprocessingDrawing" xmlns:wp="http://schemas.openxmlformats.org/drawingml/2006/wordprocessingDrawing" xmlns:wpg="http://schemas.microsoft.com/office/word/2010/wordprocessingGroup" xmlns:wpi="http://schemas.microsoft.com/office/word/2010/wordprocessingInk" xmlns:wps="http://schemas.microsoft.com/office/word/2010/wordprocessingShape" xmlns:o="urn:schemas-microsoft-com:office:office" xmlns:v="urn:schemas-microsoft-com:vml" xmlns:w10="urn:schemas-microsoft-com:office:word" xmlns:w="http://schemas.openxmlformats.org/wordprocessingml/2006/main" xmlns:w14="http://schemas.microsoft.com/office/word/2010/wordml" xmlns:w15="http://schemas.microsoft.com/office/word/2012/wordml" xmlns:w16cex="http://schemas.microsoft.com/office/word/2018/wordml/cex" xmlns:w16cid="http://schemas.microsoft.com/office/word/2016/wordml/cid" xmlns:w16="http://schemas.microsoft.com/office/word/2018/wordml" xmlns:w16sdtdh="http://schemas.microsoft.com/office/word/2020/wordml/sdtdatahash" xmlns:w16sdtfl="http://schemas.microsoft.com/office/word/2024/wordml/sdtformatlock" xmlns:w16se="http://schemas.microsoft.com/office/word/2015/wordml/symex" xmlns:w16du="http://schemas.microsoft.com/office/word/2023/wordml/word16du" xmlns:wne="http://schemas.microsoft.com/office/word/2006/wordml" mc:Ignorable="w14 w15 w16se w16cid w16 w16cex w16sdtdh w16sdtfl w16du wp14">
   <w:body>
+    <w:p>
+      <w:pPr>
+        <w:ind w:left="360" w:hanging="360"/>
+      </w:pPr>
+      <w:r>
+        <w:t>Z5526560 Project B submission links:</w:t>
+      </w:r>
+    </w:p>
+    <w:p>
+      <w:pPr>
+        <w:ind w:left="360" w:hanging="360"/>
+      </w:pPr>
+      <w:proofErr w:type="spellStart"/>
+      <w:r>
+        <w:t>Github</w:t>
+      </w:r>
+      <w:proofErr w:type="spellEnd"/>
+      <w:r>
+        <w:t xml:space="preserve">: </w:t>
+      </w:r>
+      <w:hyperlink r:id="rId6" w:history="1">
+        <w:r>
+          <w:rPr>
+            <w:rStyle w:val="Hyperlink"/>
+          </w:rPr>
+          <w:t>https://github.com/nibizluo/z5526560_projectB</w:t>
+        </w:r>
+      </w:hyperlink>
+    </w:p>
+    <w:p>
+      <w:pPr>
+        <w:ind w:left="360" w:hanging="360"/>
+      </w:pPr>
+      <w:r>
+        <w:t xml:space="preserve">Streamlit: </w:t>
+      </w:r>
+      <w:hyperlink r:id="rId7" w:history="1">
+        <w:r>
+          <w:rPr>
+            <w:rStyle w:val="Hyperlink"/>
+          </w:rPr>
+          <w:t>https://z5526560projectb-gyeuqmaftz69sxpqphh</w:t>
+        </w:r>
+        <w:r>
+          <w:rPr>
+            <w:rStyle w:val="Hyperlink"/>
+          </w:rPr>
+          <w:t>8</w:t>
+        </w:r>
+        <w:r>
+          <w:rPr>
+            <w:rStyle w:val="Hyperlink"/>
+          </w:rPr>
+          <w:t>k6.streamlit.app/</w:t>
+        </w:r>
+      </w:hyperlink>
+    </w:p>
+    <w:p>
+      <w:pPr>
+        <w:pStyle w:val="Heading2"/>
+      </w:pPr>
+    </w:p>
     <w:p>
       <w:pPr>
         <w:pStyle w:val="Heading2"/>
@@ -209,7 +271,11 @@
         <w:t>largest fall in portfolio value from a previous peak during the backtest period.</w:t>
       </w:r>
       <w:r>
-        <w:t xml:space="preserve"> These measures were chosen as return alone does not show how much risk an investor had to take on. Growth of $1</w:t>
+        <w:t xml:space="preserve"> These measures were chosen as return alone does not show how much risk an investor had </w:t>
+      </w:r>
+      <w:r>
+        <w:lastRenderedPageBreak/>
+        <w:t>to take on. Growth of $1</w:t>
       </w:r>
       <w:r>
         <w:t xml:space="preserve"> </w:t>
@@ -437,7 +503,11 @@
         <w:t>shows that the guarded fund remained mostly equity</w:t>
       </w:r>
       <w:r>
-        <w:t>, while Combined Maximum Sharpe has more active crypto exposure,</w:t>
+        <w:t xml:space="preserve">, </w:t>
+      </w:r>
+      <w:r>
+        <w:lastRenderedPageBreak/>
+        <w:t>while Combined Maximum Sharpe has more active crypto exposure,</w:t>
       </w:r>
       <w:r>
         <w:t xml:space="preserve"> and the </w:t>
@@ -454,11 +524,7 @@
         <w:t xml:space="preserve">Figure A1shows the growth of $1 invested in each MarketBridge fund from the common out-of-sample start date of 2021-01-04. The figure highlights a clear difference between crypto </w:t>
       </w:r>
       <w:r>
-        <w:t xml:space="preserve">only and equity/combined strategies. Crypto funds went through the largest </w:t>
-      </w:r>
-      <w:r>
-        <w:lastRenderedPageBreak/>
-        <w:t>swings, crypto equal weight rose sharpl</w:t>
+        <w:t>only and equity/combined strategies. Crypto funds went through the largest swings, crypto equal weight rose sharpl</w:t>
       </w:r>
       <w:r>
         <w:t xml:space="preserve">y during 2021, at one point reaching close to 6 times the initial </w:t>
@@ -745,7 +811,11 @@
         <w:t xml:space="preserve">meaning that it took substantial risk while having a negative average return under the zero-risk free rate assumption. </w:t>
       </w:r>
       <w:r>
-        <w:t xml:space="preserve">Although the crypto maximum Sharpe fund was designed to choose portfolio with the highest estimated Sharpe ratio in each historical window, this did not </w:t>
+        <w:t xml:space="preserve">Although the </w:t>
+      </w:r>
+      <w:r>
+        <w:lastRenderedPageBreak/>
+        <w:t xml:space="preserve">crypto maximum Sharpe fund was designed to choose portfolio with the highest estimated Sharpe ratio in each historical window, this did not </w:t>
       </w:r>
       <w:r>
         <w:t>translate to actual out-of-sample result. This suggests how expected returns in crypto is volatile and difficult to estimate</w:t>
@@ -760,11 +830,7 @@
         <w:t>, the Sharpe comparison shows that the highest-return funds were not always the best after adjusting for risk.</w:t>
       </w:r>
       <w:r>
-        <w:t xml:space="preserve"> In this sample, the </w:t>
-      </w:r>
-      <w:r>
-        <w:lastRenderedPageBreak/>
-        <w:t>strongest balance between return and risk came from the combined maximum Sharpe approach rather than the crypto only approaches.</w:t>
+        <w:t xml:space="preserve"> In this sample, the strongest balance between return and risk came from the combined maximum Sharpe approach rather than the crypto only approaches.</w:t>
       </w:r>
     </w:p>
     <w:p>
@@ -896,7 +962,11 @@
         <w:t>converting financial headlines into sector level sentiment index. While the backtest in Section 2 was based on structured price and return data, the sentiment index uses unstructured data</w:t>
       </w:r>
       <w:r>
-        <w:t xml:space="preserve"> such as news headlines to measure the tone of the market information across sectors. This is important as investors may not only react to historical returns and volatility, but also to news about earnings, regulations, growth, news headlines. T</w:t>
+        <w:t xml:space="preserve"> such as news headlines to measure the tone of the market information across sectors. This is </w:t>
+      </w:r>
+      <w:r>
+        <w:lastRenderedPageBreak/>
+        <w:t>important as investors may not only react to historical returns and volatility, but also to news about earnings, regulations, growth, news headlines. T</w:t>
       </w:r>
       <w:r>
         <w:t>his helps MarketBridge combined fund performance analysis with news context that investors may also consider when making financial decisions.</w:t>
@@ -904,7 +974,6 @@
     </w:p>
     <w:p>
       <w:r>
-        <w:lastRenderedPageBreak/>
         <w:t>The baseline sentiment index was constructed using VADER, a rule-based sentiment model that converts each headline into a compound sentiment score between -1 and +1. A more positive score indicates a more favourable news tone, while a more negative score indicated a more unfavourable tone.</w:t>
       </w:r>
       <w:r>
@@ -1018,6 +1087,7 @@
     </w:p>
     <w:p>
       <w:r>
+        <w:lastRenderedPageBreak/>
         <w:t xml:space="preserve">Figure A6 compares the base Guarded Minimum Variance fund with the VADER sentiment-tilted version. The results are almost identical across annualised return, annualised volatility, Sharpe ratio and maximum drawdown. </w:t>
       </w:r>
       <w:r>
@@ -1039,7 +1109,6 @@
         <w:t xml:space="preserve"> to </w:t>
       </w:r>
       <w:r>
-        <w:lastRenderedPageBreak/>
         <w:t>0.5148. This shows that the basic VADER sentiment tilt did not materially improve performance in this sample.</w:t>
       </w:r>
     </w:p>
@@ -1170,12 +1239,15 @@
         <w:t>4</w:t>
       </w:r>
       <w:r>
-        <w:t xml:space="preserve"> show that transaction costs differed across funds. The Equal Weight funds had very low average turnover since their weights changed less at each rebalance, so their estimated cost drag was small. In contrast, the Maximum Sharpe funds had much higher average turnover, especially Combined Maximum Sharpe and Equity Maximum Sharpe, since their portfolio weights changed more actively over time. This led to larger estimated cost drag.</w:t>
+        <w:t xml:space="preserve"> show that transaction costs differed across funds. The Equal Weight funds had very low average turnover since their weights changed less at each </w:t>
+      </w:r>
+      <w:r>
+        <w:lastRenderedPageBreak/>
+        <w:t>rebalance, so their estimated cost drag was small. In contrast, the Maximum Sharpe funds had much higher average turnover, especially Combined Maximum Sharpe and Equity Maximum Sharpe, since their portfolio weights changed more actively over time. This led to larger estimated cost drag.</w:t>
       </w:r>
     </w:p>
     <w:p>
       <w:r>
-        <w:lastRenderedPageBreak/>
         <w:t>The results also show that transaction cost drag is not determined by turnover alone. For example, Crypto Minimum Variance</w:t>
       </w:r>
       <w:r>
@@ -1298,7 +1370,11 @@
         <w:t>all around 0.99. This means that the finance lexicon did not completely change the sentimen</w:t>
       </w:r>
       <w:r>
-        <w:t xml:space="preserve">t signal but only made small adjustments. The largest average changes </w:t>
+        <w:t xml:space="preserve">t signal but only made small adjustments. The largest average </w:t>
+      </w:r>
+      <w:r>
+        <w:lastRenderedPageBreak/>
+        <w:t xml:space="preserve">changes </w:t>
       </w:r>
       <w:proofErr w:type="gramStart"/>
       <w:r>
@@ -1314,7 +1390,6 @@
     </w:p>
     <w:p>
       <w:r>
-        <w:lastRenderedPageBreak/>
         <w:t xml:space="preserve">The finance adjusted sentiment signal was then tested using the same Guarded Minimum Variance framework. This created a third fund, Guarded Minimum Variance with Finance Lexicon Sentiment Tilt, while keep the same constraint of 20% crypto cap and lagged sentiment rule. The result did not improve </w:t>
       </w:r>
       <w:r>
@@ -1449,6 +1524,7 @@
           <w:sz w:val="24"/>
           <w:szCs w:val="24"/>
         </w:rPr>
+        <w:lastRenderedPageBreak/>
         <w:t>Figure A</w:t>
       </w:r>
       <w:r>
@@ -1467,17 +1543,7 @@
           <w:sz w:val="24"/>
           <w:szCs w:val="24"/>
         </w:rPr>
-        <w:t xml:space="preserve"> shows the custom allocation tool where investors can choose different fund strategies. This feature allows investors to choose different funds and assign their own portfolio weights. The app then normalises the weights, calculates the combined </w:t>
-      </w:r>
-      <w:r>
-        <w:rPr>
-          <w:i w:val="0"/>
-          <w:iCs w:val="0"/>
-          <w:sz w:val="24"/>
-          <w:szCs w:val="24"/>
-        </w:rPr>
-        <w:lastRenderedPageBreak/>
-        <w:t xml:space="preserve">portfolio return path and reports key metrics such as cumulative return, annualised return, volatility, Sharpe ratio and maximum drawdown. This is crucial for investors as users not only compare individual funds </w:t>
+        <w:t xml:space="preserve"> shows the custom allocation tool where investors can choose different fund strategies. This feature allows investors to choose different funds and assign their own portfolio weights. The app then normalises the weights, calculates the combined portfolio return path and reports key metrics such as cumulative return, annualised return, volatility, Sharpe ratio and maximum drawdown. This is crucial for investors as users not only compare individual funds </w:t>
       </w:r>
       <w:r>
         <w:rPr>
@@ -6306,7 +6372,7 @@
                     <pic:cNvPicPr/>
                   </pic:nvPicPr>
                   <pic:blipFill>
-                    <a:blip r:embed="rId6"/>
+                    <a:blip r:embed="rId8"/>
                     <a:stretch>
                       <a:fillRect/>
                     </a:stretch>
@@ -6370,7 +6436,7 @@
                     <pic:cNvPicPr/>
                   </pic:nvPicPr>
                   <pic:blipFill>
-                    <a:blip r:embed="rId7"/>
+                    <a:blip r:embed="rId9"/>
                     <a:stretch>
                       <a:fillRect/>
                     </a:stretch>
@@ -6435,7 +6501,7 @@
                     <pic:cNvPicPr/>
                   </pic:nvPicPr>
                   <pic:blipFill>
-                    <a:blip r:embed="rId8"/>
+                    <a:blip r:embed="rId10"/>
                     <a:stretch>
                       <a:fillRect/>
                     </a:stretch>
@@ -6500,7 +6566,7 @@
                     <pic:cNvPicPr/>
                   </pic:nvPicPr>
                   <pic:blipFill>
-                    <a:blip r:embed="rId9"/>
+                    <a:blip r:embed="rId11"/>
                     <a:stretch>
                       <a:fillRect/>
                     </a:stretch>
@@ -7275,7 +7341,7 @@
                     <pic:cNvPicPr/>
                   </pic:nvPicPr>
                   <pic:blipFill>
-                    <a:blip r:embed="rId10"/>
+                    <a:blip r:embed="rId12"/>
                     <a:stretch>
                       <a:fillRect/>
                     </a:stretch>
@@ -7340,7 +7406,7 @@
                     <pic:cNvPicPr/>
                   </pic:nvPicPr>
                   <pic:blipFill>
-                    <a:blip r:embed="rId11"/>
+                    <a:blip r:embed="rId13"/>
                     <a:stretch>
                       <a:fillRect/>
                     </a:stretch>
@@ -8182,7 +8248,7 @@
                     <pic:cNvPicPr/>
                   </pic:nvPicPr>
                   <pic:blipFill>
-                    <a:blip r:embed="rId12"/>
+                    <a:blip r:embed="rId14"/>
                     <a:stretch>
                       <a:fillRect/>
                     </a:stretch>
@@ -9051,7 +9117,7 @@
                     <pic:cNvPicPr/>
                   </pic:nvPicPr>
                   <pic:blipFill>
-                    <a:blip r:embed="rId13" cstate="print">
+                    <a:blip r:embed="rId15" cstate="print">
                       <a:extLst>
                         <a:ext uri="{28A0092B-C50C-407E-A947-70E740481C1C}">
                           <a14:useLocalDpi xmlns:a14="http://schemas.microsoft.com/office/drawing/2010/main" val="0"/>
@@ -9116,7 +9182,7 @@
                     <pic:cNvPicPr/>
                   </pic:nvPicPr>
                   <pic:blipFill>
-                    <a:blip r:embed="rId14" cstate="print">
+                    <a:blip r:embed="rId16" cstate="print">
                       <a:extLst>
                         <a:ext uri="{28A0092B-C50C-407E-A947-70E740481C1C}">
                           <a14:useLocalDpi xmlns:a14="http://schemas.microsoft.com/office/drawing/2010/main" val="0"/>
@@ -9167,7 +9233,7 @@
         </w:rPr>
         <w:lastRenderedPageBreak/>
         <w:drawing>
-          <wp:inline distT="0" distB="0" distL="0" distR="0" wp14:anchorId="1678054E" wp14:editId="0D894397">
+          <wp:inline distT="0" distB="0" distL="0" distR="0" wp14:anchorId="1678054E" wp14:editId="0E3B79BC">
             <wp:extent cx="4320540" cy="4443560"/>
             <wp:effectExtent l="0" t="0" r="0" b="1905"/>
             <wp:docPr id="1442865639" name="Picture 1"/>
@@ -9182,7 +9248,7 @@
                     <pic:cNvPicPr/>
                   </pic:nvPicPr>
                   <pic:blipFill>
-                    <a:blip r:embed="rId15" cstate="print">
+                    <a:blip r:embed="rId17" cstate="print">
                       <a:extLst>
                         <a:ext uri="{28A0092B-C50C-407E-A947-70E740481C1C}">
                           <a14:useLocalDpi xmlns:a14="http://schemas.microsoft.com/office/drawing/2010/main" val="0"/>
@@ -9228,7 +9294,7 @@
                     <pic:cNvPicPr/>
                   </pic:nvPicPr>
                   <pic:blipFill>
-                    <a:blip r:embed="rId16" cstate="print">
+                    <a:blip r:embed="rId18" cstate="print">
                       <a:extLst>
                         <a:ext uri="{28A0092B-C50C-407E-A947-70E740481C1C}">
                           <a14:useLocalDpi xmlns:a14="http://schemas.microsoft.com/office/drawing/2010/main" val="0"/>
@@ -9325,7 +9391,7 @@
         </w:rPr>
         <w:t xml:space="preserve">. [online] CFA Institute. Available at: </w:t>
       </w:r>
-      <w:hyperlink r:id="rId17" w:history="1">
+      <w:hyperlink r:id="rId19" w:history="1">
         <w:r>
           <w:rPr>
             <w:rStyle w:val="Hyperlink"/>
@@ -9383,7 +9449,7 @@
         </w:rPr>
         <w:t xml:space="preserve">. [online] Available at: </w:t>
       </w:r>
-      <w:hyperlink r:id="rId18" w:history="1">
+      <w:hyperlink r:id="rId20" w:history="1">
         <w:r>
           <w:rPr>
             <w:rStyle w:val="Hyperlink"/>
@@ -10796,6 +10862,18 @@
       <w:shd w:val="clear" w:color="auto" w:fill="E1DFDD"/>
     </w:rPr>
   </w:style>
+  <w:style w:type="character" w:styleId="FollowedHyperlink">
+    <w:name w:val="FollowedHyperlink"/>
+    <w:basedOn w:val="DefaultParagraphFont"/>
+    <w:uiPriority w:val="99"/>
+    <w:semiHidden/>
+    <w:unhideWhenUsed/>
+    <w:rsid w:val="00E61603"/>
+    <w:rPr>
+      <w:color w:val="96607D" w:themeColor="followedHyperlink"/>
+      <w:u w:val="single"/>
+    </w:rPr>
+  </w:style>
 </w:styles>
 </file>
 

</xml_diff>